<commit_message>
feat(analysis): add task figure and literature appendix
Visualise Table 1 as a bar chart of labour time by task, coloured by
activity group, with a short summary of group shares. Add Appendix B
listing five relevant references from Zotero, each with a sentence on
its relevance, plus a references.bib and reference list. Fix number
formatting that padded short values with a leading space.

Prompts:
- 2026-09-29-002-create-colorful-informative-figure-table-1
- 2026-09-29-003-find-five-zotero-references-most-relevant

Assisted-by: Claude claude-opus-5-5
</commit_message>
<xml_diff>
--- a/analysis/q1-total-job-time/_manuscript/index.docx
+++ b/analysis/q1-total-job-time/_manuscript/index.docx
@@ -403,7 +403,7 @@
       </w:r>
     </w:p>
     <w:bookmarkEnd w:id="11"/>
-    <w:bookmarkStart w:id="18" w:name="results"/>
+    <w:bookmarkStart w:id="23" w:name="results"/>
     <w:p>
       <w:pPr>
         <w:pStyle w:val="Heading1"/>
@@ -1248,7 +1248,7 @@
       <w:pPr>
         <w:pStyle w:val="BodyText"/>
       </w:pPr>
-      <w:hyperlink w:anchor="fig-jobs">
+      <w:hyperlink w:anchor="fig-task">
         <w:r>
           <w:rPr>
             <w:rStyle w:val="Hyperlink"/>
@@ -1260,27 +1260,16 @@
         <w:t xml:space="preserve"> </w:t>
       </w:r>
       <w:r>
-        <w:t xml:space="preserve">shows the labour time of each job. Labour time varies widely between jobs;</w:t>
-      </w:r>
-      <w:r>
-        <w:t xml:space="preserve"> </w:t>
-      </w:r>
-      <w:hyperlink w:anchor="tbl-jobs">
-        <w:r>
-          <w:rPr>
-            <w:rStyle w:val="Hyperlink"/>
-          </w:rPr>
-          <w:t xml:space="preserve">Table 2</w:t>
-        </w:r>
-      </w:hyperlink>
-      <w:r>
-        <w:t xml:space="preserve"> </w:t>
-      </w:r>
-      <w:r>
-        <w:t xml:space="preserve">in the appendix lists the values for every job.</w:t>
+        <w:t xml:space="preserve">shows the same breakdown, with tasks coloured by the kind of work</w:t>
+      </w:r>
+      <w:r>
+        <w:t xml:space="preserve"> </w:t>
+      </w:r>
+      <w:r>
+        <w:t xml:space="preserve">they belong to.</w:t>
       </w:r>
     </w:p>
-    <w:bookmarkStart w:id="17" w:name="cell-fig-jobs"/>
+    <w:bookmarkStart w:id="17" w:name="cell-fig-task"/>
     <w:tbl>
       <w:tblPr>
         <w:tblStyle w:val="Table"/>
@@ -1294,7 +1283,206 @@
       <w:tr>
         <w:tc>
           <w:tcPr/>
-          <w:bookmarkStart w:id="16" w:name="fig-jobs"/>
+          <w:bookmarkStart w:id="16" w:name="fig-task"/>
+          <w:p>
+            <w:pPr>
+              <w:pStyle w:val="Compact"/>
+              <w:jc w:val="center"/>
+            </w:pPr>
+            <w:r>
+              <w:drawing>
+                <wp:inline>
+                  <wp:extent cx="5334000" cy="3446584"/>
+                  <wp:effectExtent b="0" l="0" r="0" t="0"/>
+                  <wp:docPr descr="" title="" id="14" name="Picture"/>
+                  <a:graphic>
+                    <a:graphicData uri="http://schemas.openxmlformats.org/drawingml/2006/picture">
+                      <pic:pic>
+                        <pic:nvPicPr>
+                          <pic:cNvPr descr="index_files/figure-docx/fig-task-1.png" id="15" name="Picture"/>
+                          <pic:cNvPicPr>
+                            <a:picLocks noChangeArrowheads="1" noChangeAspect="1"/>
+                          </pic:cNvPicPr>
+                        </pic:nvPicPr>
+                        <pic:blipFill>
+                          <a:blip r:embed="rId13"/>
+                          <a:stretch>
+                            <a:fillRect/>
+                          </a:stretch>
+                        </pic:blipFill>
+                        <pic:spPr bwMode="auto">
+                          <a:xfrm>
+                            <a:off x="0" y="0"/>
+                            <a:ext cx="5334000" cy="3446584"/>
+                          </a:xfrm>
+                          <a:prstGeom prst="rect">
+                            <a:avLst/>
+                          </a:prstGeom>
+                          <a:noFill/>
+                          <a:ln w="9525">
+                            <a:noFill/>
+                            <a:headEnd/>
+                            <a:tailEnd/>
+                          </a:ln>
+                        </pic:spPr>
+                      </pic:pic>
+                    </a:graphicData>
+                  </a:graphic>
+                </wp:inline>
+              </w:drawing>
+            </w:r>
+          </w:p>
+          <w:p>
+            <w:pPr>
+              <w:jc w:val="center"/>
+            </w:pPr>
+            <w:pPr>
+              <w:jc w:val="left"/>
+              <w:spacing w:before="200"/>
+              <w:pStyle w:val="ImageCaption"/>
+            </w:pPr>
+            <w:r>
+              <w:t xml:space="preserve">Figure 1: Labour time by main task across all 36 jobs, coloured by activity group. Labels give person-hours and share of total labour time.</w:t>
+            </w:r>
+          </w:p>
+          <w:bookmarkEnd w:id="16"/>
+        </w:tc>
+      </w:tr>
+    </w:tbl>
+    <w:p>
+      <w:pPr>
+        <w:pStyle w:val="BodyText"/>
+      </w:pPr>
+      <w:r>
+        <w:rPr>
+          <w:vertAlign w:val="subscript"/>
+        </w:rPr>
+        <w:t xml:space="preserve">Source:</w:t>
+      </w:r>
+      <w:r>
+        <w:rPr>
+          <w:vertAlign w:val="subscript"/>
+        </w:rPr>
+        <w:t xml:space="preserve"> </w:t>
+      </w:r>
+      <w:hyperlink r:id="rId9">
+        <w:r>
+          <w:rPr>
+            <w:rStyle w:val="Hyperlink"/>
+            <w:vertAlign w:val="subscript"/>
+          </w:rPr>
+          <w:t xml:space="preserve">Article Notebook</w:t>
+        </w:r>
+      </w:hyperlink>
+    </w:p>
+    <w:bookmarkEnd w:id="17"/>
+    <w:p>
+      <w:pPr>
+        <w:pStyle w:val="BodyText"/>
+      </w:pPr>
+      <w:r>
+        <w:t xml:space="preserve">Grouped this way, the tasks that directly empty the pit (fluidizing,</w:t>
+      </w:r>
+      <w:r>
+        <w:t xml:space="preserve"> </w:t>
+      </w:r>
+      <w:r>
+        <w:t xml:space="preserve">extraction, sludge handling and disposal) account for</w:t>
+      </w:r>
+      <w:r>
+        <w:t xml:space="preserve"> </w:t>
+      </w:r>
+      <w:r>
+        <w:t xml:space="preserve">148.1 person-hours</w:t>
+      </w:r>
+      <w:r>
+        <w:t xml:space="preserve"> </w:t>
+      </w:r>
+      <w:r>
+        <w:t xml:space="preserve">(29.1 %), about the</w:t>
+      </w:r>
+      <w:r>
+        <w:t xml:space="preserve"> </w:t>
+      </w:r>
+      <w:r>
+        <w:t xml:space="preserve">same as Rest (150.4 person-hours). Support tasks take</w:t>
+      </w:r>
+      <w:r>
+        <w:t xml:space="preserve"> </w:t>
+      </w:r>
+      <w:r>
+        <w:t xml:space="preserve">124.2 person-hours</w:t>
+      </w:r>
+      <w:r>
+        <w:t xml:space="preserve"> </w:t>
+      </w:r>
+      <w:r>
+        <w:t xml:space="preserve">(24.4 %) and site and</w:t>
+      </w:r>
+      <w:r>
+        <w:t xml:space="preserve"> </w:t>
+      </w:r>
+      <w:r>
+        <w:t xml:space="preserve">structure works 86.3 person-hours</w:t>
+      </w:r>
+      <w:r>
+        <w:t xml:space="preserve"> </w:t>
+      </w:r>
+      <w:r>
+        <w:t xml:space="preserve">(16.9 %).</w:t>
+      </w:r>
+    </w:p>
+    <w:p>
+      <w:pPr>
+        <w:pStyle w:val="BodyText"/>
+      </w:pPr>
+      <w:hyperlink w:anchor="fig-jobs">
+        <w:r>
+          <w:rPr>
+            <w:rStyle w:val="Hyperlink"/>
+          </w:rPr>
+          <w:t xml:space="preserve">Figure 2</w:t>
+        </w:r>
+      </w:hyperlink>
+      <w:r>
+        <w:t xml:space="preserve"> </w:t>
+      </w:r>
+      <w:r>
+        <w:t xml:space="preserve">shows the labour time of each job. Labour time varies widely between jobs;</w:t>
+      </w:r>
+      <w:r>
+        <w:t xml:space="preserve"> </w:t>
+      </w:r>
+      <w:hyperlink w:anchor="tbl-jobs">
+        <w:r>
+          <w:rPr>
+            <w:rStyle w:val="Hyperlink"/>
+          </w:rPr>
+          <w:t xml:space="preserve">Table 2</w:t>
+        </w:r>
+      </w:hyperlink>
+      <w:r>
+        <w:t xml:space="preserve"> </w:t>
+      </w:r>
+      <w:r>
+        <w:t xml:space="preserve">in the appendix lists the values for every job.</w:t>
+      </w:r>
+    </w:p>
+    <w:bookmarkStart w:id="22" w:name="cell-fig-jobs"/>
+    <w:tbl>
+      <w:tblPr>
+        <w:tblStyle w:val="Table"/>
+        <w:tblW w:type="pct" w:w="5000"/>
+        <w:tblLayout w:type="fixed"/>
+        <w:tblLook w:firstRow="0" w:lastRow="0" w:firstColumn="0" w:lastColumn="0" w:noHBand="0" w:noVBand="0" w:val="0000"/>
+      </w:tblPr>
+      <w:tblGrid>
+        <w:gridCol w:w="7920"/>
+      </w:tblGrid>
+      <w:tr>
+        <w:tc>
+          <w:tcPr/>
+          <w:bookmarkStart w:id="21" w:name="fig-jobs"/>
           <w:p>
             <w:pPr>
               <w:pStyle w:val="Compact"/>
@@ -1305,18 +1493,18 @@
                 <wp:inline>
                   <wp:extent cx="5334000" cy="4923692"/>
                   <wp:effectExtent b="0" l="0" r="0" t="0"/>
-                  <wp:docPr descr="" title="" id="14" name="Picture"/>
+                  <wp:docPr descr="" title="" id="19" name="Picture"/>
                   <a:graphic>
                     <a:graphicData uri="http://schemas.openxmlformats.org/drawingml/2006/picture">
                       <pic:pic>
                         <pic:nvPicPr>
-                          <pic:cNvPr descr="index_files/figure-docx/fig-jobs-1.png" id="15" name="Picture"/>
+                          <pic:cNvPr descr="index_files/figure-docx/fig-jobs-1.png" id="20" name="Picture"/>
                           <pic:cNvPicPr>
                             <a:picLocks noChangeArrowheads="1" noChangeAspect="1"/>
                           </pic:cNvPicPr>
                         </pic:nvPicPr>
                         <pic:blipFill>
-                          <a:blip r:embed="rId13"/>
+                          <a:blip r:embed="rId18"/>
                           <a:stretch>
                             <a:fillRect/>
                           </a:stretch>
@@ -1353,10 +1541,10 @@
               <w:pStyle w:val="ImageCaption"/>
             </w:pPr>
             <w:r>
-              <w:t xml:space="preserve">Figure 1: Labour time (person-hours) per pit emptying job, ordered by date.</w:t>
+              <w:t xml:space="preserve">Figure 2: Labour time (person-hours) per pit emptying job, ordered by date.</w:t>
             </w:r>
           </w:p>
-          <w:bookmarkEnd w:id="16"/>
+          <w:bookmarkEnd w:id="21"/>
         </w:tc>
       </w:tr>
     </w:tbl>
@@ -1386,9 +1574,9 @@
         </w:r>
       </w:hyperlink>
     </w:p>
-    <w:bookmarkEnd w:id="17"/>
-    <w:bookmarkEnd w:id="18"/>
-    <w:bookmarkStart w:id="19" w:name="conclusion"/>
+    <w:bookmarkEnd w:id="22"/>
+    <w:bookmarkEnd w:id="23"/>
+    <w:bookmarkStart w:id="24" w:name="conclusion"/>
     <w:p>
       <w:pPr>
         <w:pStyle w:val="Heading1"/>
@@ -1439,14 +1627,14 @@
         <w:t xml:space="preserve">capacity consumed by the service.</w:t>
       </w:r>
     </w:p>
-    <w:bookmarkEnd w:id="19"/>
-    <w:bookmarkStart w:id="21" w:name="appendix"/>
+    <w:bookmarkEnd w:id="24"/>
+    <w:bookmarkStart w:id="26" w:name="appendix-a-job-level-results"/>
     <w:p>
       <w:pPr>
         <w:pStyle w:val="Heading1"/>
       </w:pPr>
       <w:r>
-        <w:t xml:space="preserve">5. Appendix</w:t>
+        <w:t xml:space="preserve">5. Appendix A: Job-level results</w:t>
       </w:r>
     </w:p>
     <w:tbl>
@@ -1462,7 +1650,7 @@
       <w:tr>
         <w:tc>
           <w:tcPr/>
-          <w:bookmarkStart w:id="20" w:name="tbl-jobs"/>
+          <w:bookmarkStart w:id="25" w:name="tbl-jobs"/>
           <w:p>
             <w:pPr>
               <w:jc w:val="center"/>
@@ -4039,7 +4227,7 @@
               </w:tc>
             </w:tr>
           </w:tbl>
-          <w:bookmarkEnd w:id="20"/>
+          <w:bookmarkEnd w:id="25"/>
           <w:p/>
         </w:tc>
       </w:tr>
@@ -4070,7 +4258,486 @@
         </w:r>
       </w:hyperlink>
     </w:p>
-    <w:bookmarkEnd w:id="21"/>
+    <w:bookmarkEnd w:id="26"/>
+    <w:bookmarkStart w:id="27" w:name="appendix-b-relevant-literature"/>
+    <w:p>
+      <w:pPr>
+        <w:pStyle w:val="Heading1"/>
+      </w:pPr>
+      <w:r>
+        <w:t xml:space="preserve">6. Appendix B: Relevant literature</w:t>
+      </w:r>
+    </w:p>
+    <w:p>
+      <w:pPr>
+        <w:pStyle w:val="FirstParagraph"/>
+      </w:pPr>
+      <w:r>
+        <w:t xml:space="preserve">The five references in the author’s Zotero library most relevant to this</w:t>
+      </w:r>
+      <w:r>
+        <w:t xml:space="preserve"> </w:t>
+      </w:r>
+      <w:r>
+        <w:t xml:space="preserve">dataset, with one sentence on why each matters here:</w:t>
+      </w:r>
+    </w:p>
+    <w:p>
+      <w:pPr>
+        <w:pStyle w:val="Compact"/>
+        <w:numPr>
+          <w:ilvl w:val="0"/>
+          <w:numId w:val="1002"/>
+        </w:numPr>
+      </w:pPr>
+      <w:r>
+        <w:t xml:space="preserve">Yesaya et al. (2021)</w:t>
+      </w:r>
+      <w:r>
+        <w:t xml:space="preserve"> </w:t>
+      </w:r>
+      <w:r>
+        <w:t xml:space="preserve">apply time-driven activity-based costing to compost</w:t>
+      </w:r>
+      <w:r>
+        <w:t xml:space="preserve"> </w:t>
+      </w:r>
+      <w:r>
+        <w:t xml:space="preserve">production in Blantyre, Malawi, making it the closest methodological</w:t>
+      </w:r>
+      <w:r>
+        <w:t xml:space="preserve"> </w:t>
+      </w:r>
+      <w:r>
+        <w:t xml:space="preserve">precedent for turning task-level timing data like these into activity costs.</w:t>
+      </w:r>
+    </w:p>
+    <w:p>
+      <w:pPr>
+        <w:pStyle w:val="Compact"/>
+        <w:numPr>
+          <w:ilvl w:val="0"/>
+          <w:numId w:val="1002"/>
+        </w:numPr>
+      </w:pPr>
+      <w:r>
+        <w:t xml:space="preserve">Wilcox et al. (2026)</w:t>
+      </w:r>
+      <w:r>
+        <w:t xml:space="preserve"> </w:t>
+      </w:r>
+      <w:r>
+        <w:t xml:space="preserve">analyse the costs of 23 formal manual emptying providers in</w:t>
+      </w:r>
+      <w:r>
+        <w:t xml:space="preserve"> </w:t>
+      </w:r>
+      <w:r>
+        <w:t xml:space="preserve">Malawi and Uganda and find labour is what makes manual emptying expensive,</w:t>
+      </w:r>
+      <w:r>
+        <w:t xml:space="preserve"> </w:t>
+      </w:r>
+      <w:r>
+        <w:t xml:space="preserve">which is why the person-hours measured here are the key input for costing.</w:t>
+      </w:r>
+    </w:p>
+    <w:p>
+      <w:pPr>
+        <w:pStyle w:val="Compact"/>
+        <w:numPr>
+          <w:ilvl w:val="0"/>
+          <w:numId w:val="1002"/>
+        </w:numPr>
+      </w:pPr>
+      <w:r>
+        <w:t xml:space="preserve">Chipeta et al. (2017)</w:t>
+      </w:r>
+      <w:r>
+        <w:t xml:space="preserve"> </w:t>
+      </w:r>
+      <w:r>
+        <w:t xml:space="preserve">designed and tested the pedal-powered Gulper pump in</w:t>
+      </w:r>
+      <w:r>
+        <w:t xml:space="preserve"> </w:t>
+      </w:r>
+      <w:r>
+        <w:t xml:space="preserve">Mzuzu and estimated that a pit can be emptied in 1–2 hours when trash</w:t>
+      </w:r>
+      <w:r>
+        <w:t xml:space="preserve"> </w:t>
+      </w:r>
+      <w:r>
+        <w:t xml:space="preserve">content is low, a benchmark for the job durations recorded here.</w:t>
+      </w:r>
+    </w:p>
+    <w:p>
+      <w:pPr>
+        <w:pStyle w:val="Compact"/>
+        <w:numPr>
+          <w:ilvl w:val="0"/>
+          <w:numId w:val="1002"/>
+        </w:numPr>
+      </w:pPr>
+      <w:r>
+        <w:t xml:space="preserve">Chiposa et al. (2017)</w:t>
+      </w:r>
+      <w:r>
+        <w:t xml:space="preserve"> </w:t>
+      </w:r>
+      <w:r>
+        <w:t xml:space="preserve">characterise pit latrines in peri-urban Mzuzu,</w:t>
+      </w:r>
+      <w:r>
+        <w:t xml:space="preserve"> </w:t>
+      </w:r>
+      <w:r>
+        <w:t xml:space="preserve">reporting that 90 % of households also dispose of domestic waste in their</w:t>
+      </w:r>
+      <w:r>
+        <w:t xml:space="preserve"> </w:t>
+      </w:r>
+      <w:r>
+        <w:t xml:space="preserve">pits, which helps explain the time spent on tasks such as pulling out trash.</w:t>
+      </w:r>
+    </w:p>
+    <w:p>
+      <w:pPr>
+        <w:pStyle w:val="Compact"/>
+        <w:numPr>
+          <w:ilvl w:val="0"/>
+          <w:numId w:val="1002"/>
+        </w:numPr>
+      </w:pPr>
+      <w:r>
+        <w:t xml:space="preserve">Burt et al. (2019)</w:t>
+      </w:r>
+      <w:r>
+        <w:t xml:space="preserve"> </w:t>
+      </w:r>
+      <w:r>
+        <w:t xml:space="preserve">estimate the cost of delivering pit emptying services in</w:t>
+      </w:r>
+      <w:r>
+        <w:t xml:space="preserve"> </w:t>
+      </w:r>
+      <w:r>
+        <w:t xml:space="preserve">Kigali, Rwanda, at different scales, giving a comparison point for costs</w:t>
+      </w:r>
+      <w:r>
+        <w:t xml:space="preserve"> </w:t>
+      </w:r>
+      <w:r>
+        <w:t xml:space="preserve">derived from the labour time reported here.</w:t>
+      </w:r>
+    </w:p>
+    <w:bookmarkEnd w:id="27"/>
+    <w:bookmarkStart w:id="39" w:name="references"/>
+    <w:p>
+      <w:pPr>
+        <w:pStyle w:val="Heading1"/>
+      </w:pPr>
+      <w:r>
+        <w:t xml:space="preserve">7. References</w:t>
+      </w:r>
+    </w:p>
+    <w:bookmarkStart w:id="38" w:name="refs"/>
+    <w:bookmarkStart w:id="29" w:name="ref-burt2019costs"/>
+    <w:p>
+      <w:pPr>
+        <w:pStyle w:val="Bibliography"/>
+      </w:pPr>
+      <w:r>
+        <w:t xml:space="preserve">Burt, Zachary, Rachel Sklar, and Ashley Murray. 2019.</w:t>
+      </w:r>
+      <w:r>
+        <w:t xml:space="preserve"> </w:t>
+      </w:r>
+      <w:r>
+        <w:t xml:space="preserve">“Costs and Willingness to Pay for Pit Latrine Emptying Services in</w:t>
+      </w:r>
+      <w:r>
+        <w:t xml:space="preserve"> </w:t>
+      </w:r>
+      <w:r>
+        <w:t xml:space="preserve">Kigali</w:t>
+      </w:r>
+      <w:r>
+        <w:t xml:space="preserve">,</w:t>
+      </w:r>
+      <w:r>
+        <w:t xml:space="preserve"> </w:t>
+      </w:r>
+      <w:r>
+        <w:t xml:space="preserve">Rwanda</w:t>
+      </w:r>
+      <w:r>
+        <w:t xml:space="preserve">.”</w:t>
+      </w:r>
+      <w:r>
+        <w:t xml:space="preserve"> </w:t>
+      </w:r>
+      <w:r>
+        <w:rPr>
+          <w:i/>
+          <w:iCs/>
+        </w:rPr>
+        <w:t xml:space="preserve">International Journal of Environmental Research and Public Health</w:t>
+      </w:r>
+      <w:r>
+        <w:t xml:space="preserve"> </w:t>
+      </w:r>
+      <w:r>
+        <w:t xml:space="preserve">16 (23): 4738.</w:t>
+      </w:r>
+      <w:r>
+        <w:t xml:space="preserve"> </w:t>
+      </w:r>
+      <w:hyperlink r:id="rId28">
+        <w:r>
+          <w:rPr>
+            <w:rStyle w:val="Hyperlink"/>
+          </w:rPr>
+          <w:t xml:space="preserve">https://doi.org/10.3390/ijerph16234738</w:t>
+        </w:r>
+      </w:hyperlink>
+      <w:r>
+        <w:t xml:space="preserve">.</w:t>
+      </w:r>
+    </w:p>
+    <w:bookmarkEnd w:id="29"/>
+    <w:bookmarkStart w:id="31" w:name="ref-chipeta2017designing"/>
+    <w:p>
+      <w:pPr>
+        <w:pStyle w:val="Bibliography"/>
+      </w:pPr>
+      <w:r>
+        <w:t xml:space="preserve">Chipeta, W. C., R. H. Holm, J. F. Kamanula, W. E. Mtonga, and F. L. de los Reyes. 2017.</w:t>
+      </w:r>
+      <w:r>
+        <w:t xml:space="preserve"> </w:t>
+      </w:r>
+      <w:r>
+        <w:t xml:space="preserve">“Designing Local Solutions for Emptying Pit Latrines in Low-Income Urban Settlements (</w:t>
+      </w:r>
+      <w:r>
+        <w:t xml:space="preserve">Malawi</w:t>
+      </w:r>
+      <w:r>
+        <w:t xml:space="preserve">).”</w:t>
+      </w:r>
+      <w:r>
+        <w:t xml:space="preserve"> </w:t>
+      </w:r>
+      <w:r>
+        <w:rPr>
+          <w:i/>
+          <w:iCs/>
+        </w:rPr>
+        <w:t xml:space="preserve">Physics and Chemistry of the Earth, Parts A/B/C</w:t>
+      </w:r>
+      <w:r>
+        <w:t xml:space="preserve"> </w:t>
+      </w:r>
+      <w:r>
+        <w:t xml:space="preserve">100: 336–42.</w:t>
+      </w:r>
+      <w:r>
+        <w:t xml:space="preserve"> </w:t>
+      </w:r>
+      <w:hyperlink r:id="rId30">
+        <w:r>
+          <w:rPr>
+            <w:rStyle w:val="Hyperlink"/>
+          </w:rPr>
+          <w:t xml:space="preserve">https://doi.org/10.1016/j.pce.2017.02.012</w:t>
+        </w:r>
+      </w:hyperlink>
+      <w:r>
+        <w:t xml:space="preserve">.</w:t>
+      </w:r>
+    </w:p>
+    <w:bookmarkEnd w:id="31"/>
+    <w:bookmarkStart w:id="33" w:name="ref-chiposa2017characterization"/>
+    <w:p>
+      <w:pPr>
+        <w:pStyle w:val="Bibliography"/>
+      </w:pPr>
+      <w:r>
+        <w:t xml:space="preserve">Chiposa, Rashid, Rochelle H. Holm, Chimuleke Munthali, Russel C. G. Chidya, and Francis L. de los Reyes III. 2017.</w:t>
+      </w:r>
+      <w:r>
+        <w:t xml:space="preserve"> </w:t>
+      </w:r>
+      <w:r>
+        <w:t xml:space="preserve">“Characterization of Pit Latrines to Support the Design and Selection of Emptying Tools in Peri-Urban</w:t>
+      </w:r>
+      <w:r>
+        <w:t xml:space="preserve"> </w:t>
+      </w:r>
+      <w:r>
+        <w:t xml:space="preserve">Mzuzu</w:t>
+      </w:r>
+      <w:r>
+        <w:t xml:space="preserve">,</w:t>
+      </w:r>
+      <w:r>
+        <w:t xml:space="preserve"> </w:t>
+      </w:r>
+      <w:r>
+        <w:t xml:space="preserve">Malawi</w:t>
+      </w:r>
+      <w:r>
+        <w:t xml:space="preserve">.”</w:t>
+      </w:r>
+      <w:r>
+        <w:t xml:space="preserve"> </w:t>
+      </w:r>
+      <w:r>
+        <w:rPr>
+          <w:i/>
+          <w:iCs/>
+        </w:rPr>
+        <w:t xml:space="preserve">Journal of Water, Sanitation and Hygiene for Development</w:t>
+      </w:r>
+      <w:r>
+        <w:t xml:space="preserve"> </w:t>
+      </w:r>
+      <w:r>
+        <w:t xml:space="preserve">7 (1): 151–55.</w:t>
+      </w:r>
+      <w:r>
+        <w:t xml:space="preserve"> </w:t>
+      </w:r>
+      <w:hyperlink r:id="rId32">
+        <w:r>
+          <w:rPr>
+            <w:rStyle w:val="Hyperlink"/>
+          </w:rPr>
+          <w:t xml:space="preserve">https://doi.org/10.2166/washdev.2017.096</w:t>
+        </w:r>
+      </w:hyperlink>
+      <w:r>
+        <w:t xml:space="preserve">.</w:t>
+      </w:r>
+    </w:p>
+    <w:bookmarkEnd w:id="33"/>
+    <w:bookmarkStart w:id="35" w:name="ref-wilcox2026formal"/>
+    <w:p>
+      <w:pPr>
+        <w:pStyle w:val="Bibliography"/>
+      </w:pPr>
+      <w:r>
+        <w:t xml:space="preserve">Wilcox, Jonathan D. T., Carlos E. V. Batarda, Julita C. Chinseu, Yvonne S. Lugali, Jamie K. Bartram, and Barbara E. Evans. 2026.</w:t>
+      </w:r>
+      <w:r>
+        <w:t xml:space="preserve"> </w:t>
+      </w:r>
+      <w:r>
+        <w:t xml:space="preserve">“Formal Manual Fecal Sludge Emptying and Transport Services: Cost Analysis of 23 Service Providers in</w:t>
+      </w:r>
+      <w:r>
+        <w:t xml:space="preserve"> </w:t>
+      </w:r>
+      <w:r>
+        <w:t xml:space="preserve">Malawi</w:t>
+      </w:r>
+      <w:r>
+        <w:t xml:space="preserve"> </w:t>
+      </w:r>
+      <w:r>
+        <w:t xml:space="preserve">and</w:t>
+      </w:r>
+      <w:r>
+        <w:t xml:space="preserve"> </w:t>
+      </w:r>
+      <w:r>
+        <w:t xml:space="preserve">Uganda</w:t>
+      </w:r>
+      <w:r>
+        <w:t xml:space="preserve">.”</w:t>
+      </w:r>
+      <w:r>
+        <w:t xml:space="preserve"> </w:t>
+      </w:r>
+      <w:r>
+        <w:rPr>
+          <w:i/>
+          <w:iCs/>
+        </w:rPr>
+        <w:t xml:space="preserve">Environmental Science &amp; Technology</w:t>
+      </w:r>
+      <w:r>
+        <w:t xml:space="preserve"> </w:t>
+      </w:r>
+      <w:r>
+        <w:t xml:space="preserve">60 (21): 15008–19.</w:t>
+      </w:r>
+      <w:r>
+        <w:t xml:space="preserve"> </w:t>
+      </w:r>
+      <w:hyperlink r:id="rId34">
+        <w:r>
+          <w:rPr>
+            <w:rStyle w:val="Hyperlink"/>
+          </w:rPr>
+          <w:t xml:space="preserve">https://doi.org/10.1021/acs.est.6c01385</w:t>
+        </w:r>
+      </w:hyperlink>
+      <w:r>
+        <w:t xml:space="preserve">.</w:t>
+      </w:r>
+    </w:p>
+    <w:bookmarkEnd w:id="35"/>
+    <w:bookmarkStart w:id="37" w:name="ref-yesaya2021cost"/>
+    <w:p>
+      <w:pPr>
+        <w:pStyle w:val="Bibliography"/>
+      </w:pPr>
+      <w:r>
+        <w:t xml:space="preserve">Yesaya, Mabvuto, Wrixon Mpanang’ombe, and Elizabeth Tilley. 2021.</w:t>
+      </w:r>
+      <w:r>
+        <w:t xml:space="preserve"> </w:t>
+      </w:r>
+      <w:r>
+        <w:t xml:space="preserve">“The Cost of Plastics in Compost.”</w:t>
+      </w:r>
+      <w:r>
+        <w:t xml:space="preserve"> </w:t>
+      </w:r>
+      <w:r>
+        <w:rPr>
+          <w:i/>
+          <w:iCs/>
+        </w:rPr>
+        <w:t xml:space="preserve">Frontiers in Sustainability</w:t>
+      </w:r>
+      <w:r>
+        <w:t xml:space="preserve"> </w:t>
+      </w:r>
+      <w:r>
+        <w:t xml:space="preserve">2.</w:t>
+      </w:r>
+      <w:r>
+        <w:t xml:space="preserve"> </w:t>
+      </w:r>
+      <w:hyperlink r:id="rId36">
+        <w:r>
+          <w:rPr>
+            <w:rStyle w:val="Hyperlink"/>
+          </w:rPr>
+          <w:t xml:space="preserve">https://doi.org/10.3389/frsus.2021.753413</w:t>
+        </w:r>
+      </w:hyperlink>
+      <w:r>
+        <w:t xml:space="preserve">.</w:t>
+      </w:r>
+    </w:p>
+    <w:bookmarkEnd w:id="37"/>
+    <w:bookmarkEnd w:id="38"/>
+    <w:bookmarkEnd w:id="39"/>
     <w:sectPr>
       <w:footnotePr>
         <w:numRestart w:val="eachSect"/>
@@ -4284,11 +4951,126 @@
       </w:rPr>
     </w:lvl>
   </w:abstractNum>
+  <w:abstractNum w:abstractNumId="99411">
+    <w:nsid w:val="00A99411"/>
+    <w:multiLevelType w:val="multilevel"/>
+    <w:lvl w:ilvl="0">
+      <w:start w:val="1"/>
+      <w:numFmt w:val="decimal"/>
+      <w:lvlText w:val="%1."/>
+      <w:lvlJc w:val="left"/>
+      <w:pPr>
+        <w:ind w:left="720" w:hanging="360"/>
+      </w:pPr>
+    </w:lvl>
+    <w:lvl w:ilvl="1">
+      <w:start w:val="1"/>
+      <w:numFmt w:val="decimal"/>
+      <w:lvlText w:val="%2."/>
+      <w:lvlJc w:val="left"/>
+      <w:pPr>
+        <w:ind w:left="1440" w:hanging="360"/>
+      </w:pPr>
+    </w:lvl>
+    <w:lvl w:ilvl="2">
+      <w:start w:val="1"/>
+      <w:numFmt w:val="decimal"/>
+      <w:lvlText w:val="%3."/>
+      <w:lvlJc w:val="left"/>
+      <w:pPr>
+        <w:ind w:left="2160" w:hanging="360"/>
+      </w:pPr>
+    </w:lvl>
+    <w:lvl w:ilvl="3">
+      <w:start w:val="1"/>
+      <w:numFmt w:val="decimal"/>
+      <w:lvlText w:val="%4."/>
+      <w:lvlJc w:val="left"/>
+      <w:pPr>
+        <w:ind w:left="2880" w:hanging="360"/>
+      </w:pPr>
+    </w:lvl>
+    <w:lvl w:ilvl="4">
+      <w:start w:val="1"/>
+      <w:numFmt w:val="decimal"/>
+      <w:lvlText w:val="%5."/>
+      <w:lvlJc w:val="left"/>
+      <w:pPr>
+        <w:ind w:left="3600" w:hanging="360"/>
+      </w:pPr>
+    </w:lvl>
+    <w:lvl w:ilvl="5">
+      <w:start w:val="1"/>
+      <w:numFmt w:val="decimal"/>
+      <w:lvlText w:val="%6."/>
+      <w:lvlJc w:val="left"/>
+      <w:pPr>
+        <w:ind w:left="4320" w:hanging="360"/>
+      </w:pPr>
+    </w:lvl>
+    <w:lvl w:ilvl="6">
+      <w:start w:val="1"/>
+      <w:numFmt w:val="decimal"/>
+      <w:lvlText w:val="%7."/>
+      <w:lvlJc w:val="left"/>
+      <w:pPr>
+        <w:ind w:left="5040" w:hanging="360"/>
+      </w:pPr>
+    </w:lvl>
+    <w:lvl w:ilvl="7">
+      <w:start w:val="1"/>
+      <w:numFmt w:val="decimal"/>
+      <w:lvlText w:val="%8."/>
+      <w:lvlJc w:val="left"/>
+      <w:pPr>
+        <w:ind w:left="5760" w:hanging="360"/>
+      </w:pPr>
+    </w:lvl>
+    <w:lvl w:ilvl="8">
+      <w:start w:val="1"/>
+      <w:numFmt w:val="decimal"/>
+      <w:lvlText w:val="%9."/>
+      <w:lvlJc w:val="left"/>
+      <w:pPr>
+        <w:ind w:left="6480" w:hanging="360"/>
+      </w:pPr>
+    </w:lvl>
+  </w:abstractNum>
   <w:num w:numId="1000">
     <w:abstractNumId w:val="990"/>
   </w:num>
   <w:num w:numId="1001">
     <w:abstractNumId w:val="991"/>
+  </w:num>
+  <w:num w:numId="1002">
+    <w:abstractNumId w:val="99411"/>
+    <w:lvlOverride w:ilvl="0">
+      <w:startOverride w:val="1"/>
+    </w:lvlOverride>
+    <w:lvlOverride w:ilvl="1">
+      <w:startOverride w:val="1"/>
+    </w:lvlOverride>
+    <w:lvlOverride w:ilvl="2">
+      <w:startOverride w:val="1"/>
+    </w:lvlOverride>
+    <w:lvlOverride w:ilvl="3">
+      <w:startOverride w:val="1"/>
+    </w:lvlOverride>
+    <w:lvlOverride w:ilvl="4">
+      <w:startOverride w:val="1"/>
+    </w:lvlOverride>
+    <w:lvlOverride w:ilvl="5">
+      <w:startOverride w:val="1"/>
+    </w:lvlOverride>
+    <w:lvlOverride w:ilvl="6">
+      <w:startOverride w:val="1"/>
+    </w:lvlOverride>
+    <w:lvlOverride w:ilvl="7">
+      <w:startOverride w:val="1"/>
+    </w:lvlOverride>
+    <w:lvlOverride w:ilvl="8">
+      <w:startOverride w:val="1"/>
+    </w:lvlOverride>
   </w:num>
 </w:numbering>
 </file>

</xml_diff>

<commit_message>
feat(analysis): use cleaned data in total job time
Read data/all_tasks_clean.csv instead of the raw export. Elapsed time is
now the sum of daily spans per job, so the merged two-day job
2026-06-12_01 is handled, and splitting 2026-06-14_02 into two jobs adds
its second crew's span. Total labour is unchanged at 509.0 person-hours;
total elapsed time rises from 139.4 to 143.6 clock hours over 36 jobs.
Methods describes the cleaning and Results adds a sensitivity check that
caps the four timer-suspect entries at 50 min (506.8 person-hours).

Prompts:
- 2026-09-29-014-what-are-your-next-recommendations
- 2026-09-29-015-do-whatever-you-recommend-and-commit

Closes #5

Assisted-by: Claude claude-fable-5-1
</commit_message>
<xml_diff>
--- a/analysis/q1-total-job-time/_manuscript/index.docx
+++ b/analysis/q1-total-job-time/_manuscript/index.docx
@@ -178,10 +178,10 @@
         <w:rPr>
           <w:rStyle w:val="VerbatimChar"/>
         </w:rPr>
-        <w:t xml:space="preserve">data/all_tasks.csv</w:t>
-      </w:r>
-      <w:r>
-        <w:t xml:space="preserve">) contains 10,784 task entries</w:t>
+        <w:t xml:space="preserve">data/all_tasks_clean.csv</w:t>
+      </w:r>
+      <w:r>
+        <w:t xml:space="preserve">) contains 10,778 task entries</w:t>
       </w:r>
       <w:r>
         <w:t xml:space="preserve"> </w:t>
@@ -335,7 +335,13 @@
         <w:t xml:space="preserve">entry_end_time</w:t>
       </w:r>
       <w:r>
-        <w:t xml:space="preserve">, summed across jobs. This</w:t>
+        <w:t xml:space="preserve">, summed across jobs. For</w:t>
+      </w:r>
+      <w:r>
+        <w:t xml:space="preserve"> </w:t>
+      </w:r>
+      <w:r>
+        <w:t xml:space="preserve">the one job recorded over two days the two daily intervals are added. This</w:t>
       </w:r>
       <w:r>
         <w:t xml:space="preserve"> </w:t>
@@ -369,7 +375,91 @@
         <w:pStyle w:val="BodyText"/>
       </w:pPr>
       <w:r>
-        <w:t xml:space="preserve">Data checks: the file has no missing values except</w:t>
+        <w:t xml:space="preserve">The file is the cleaned version of the raw app export, produced by</w:t>
+      </w:r>
+      <w:r>
+        <w:t xml:space="preserve"> </w:t>
+      </w:r>
+      <w:r>
+        <w:rPr>
+          <w:rStyle w:val="VerbatimChar"/>
+        </w:rPr>
+        <w:t xml:space="preserve">data-review/clean.R</w:t>
+      </w:r>
+      <w:r>
+        <w:t xml:space="preserve"> </w:t>
+      </w:r>
+      <w:r>
+        <w:t xml:space="preserve">and documented in</w:t>
+      </w:r>
+      <w:r>
+        <w:t xml:space="preserve"> </w:t>
+      </w:r>
+      <w:r>
+        <w:rPr>
+          <w:rStyle w:val="VerbatimChar"/>
+        </w:rPr>
+        <w:t xml:space="preserve">data-review/README.md</w:t>
+      </w:r>
+      <w:r>
+        <w:t xml:space="preserve">. Relative to</w:t>
+      </w:r>
+      <w:r>
+        <w:t xml:space="preserve"> </w:t>
+      </w:r>
+      <w:r>
+        <w:t xml:space="preserve">the raw export, six accidental taps shorter than 2 seconds were dropped, the</w:t>
+      </w:r>
+      <w:r>
+        <w:t xml:space="preserve"> </w:t>
+      </w:r>
+      <w:r>
+        <w:t xml:space="preserve">Equipment subtask</w:t>
+      </w:r>
+      <w:r>
+        <w:t xml:space="preserve"> </w:t>
+      </w:r>
+      <w:r>
+        <w:t xml:space="preserve">“Repair”</w:t>
+      </w:r>
+      <w:r>
+        <w:t xml:space="preserve"> </w:t>
+      </w:r>
+      <w:r>
+        <w:t xml:space="preserve">was recoded to</w:t>
+      </w:r>
+      <w:r>
+        <w:t xml:space="preserve"> </w:t>
+      </w:r>
+      <w:r>
+        <w:t xml:space="preserve">“Repairing”</w:t>
+      </w:r>
+      <w:r>
+        <w:t xml:space="preserve">, and job identities were</w:t>
+      </w:r>
+      <w:r>
+        <w:t xml:space="preserve"> </w:t>
+      </w:r>
+      <w:r>
+        <w:t xml:space="preserve">corrected from field knowledge: the recordings filed as 2026-06-12_01 and</w:t>
+      </w:r>
+      <w:r>
+        <w:t xml:space="preserve"> </w:t>
+      </w:r>
+      <w:r>
+        <w:t xml:space="preserve">2026-06-13_01 are one job carried out over two days by two crews, and the two</w:t>
+      </w:r>
+      <w:r>
+        <w:t xml:space="preserve"> </w:t>
+      </w:r>
+      <w:r>
+        <w:t xml:space="preserve">recording sessions filed under 2026-06-14_02 are two separate jobs</w:t>
+      </w:r>
+      <w:r>
+        <w:t xml:space="preserve"> </w:t>
+      </w:r>
+      <w:r>
+        <w:t xml:space="preserve">(2026-06-14_02a and 2026-06-14_02b). The file has no missing values except</w:t>
       </w:r>
       <w:r>
         <w:t xml:space="preserve"> </w:t>
@@ -381,25 +471,31 @@
         <w:t xml:space="preserve">subtask</w:t>
       </w:r>
       <w:r>
-        <w:t xml:space="preserve">, which is empty by</w:t>
-      </w:r>
-      <w:r>
-        <w:t xml:space="preserve"> </w:t>
-      </w:r>
-      <w:r>
-        <w:t xml:space="preserve">design for the Rest and Disposal tasks. Recorded durations agree with the</w:t>
-      </w:r>
-      <w:r>
-        <w:t xml:space="preserve"> </w:t>
-      </w:r>
-      <w:r>
-        <w:t xml:space="preserve">difference between end and start times to within ±1 second (rounding). No job</w:t>
-      </w:r>
-      <w:r>
-        <w:t xml:space="preserve"> </w:t>
-      </w:r>
-      <w:r>
-        <w:t xml:space="preserve">crosses midnight, so elapsed time can be computed from clock times directly.</w:t>
+        <w:t xml:space="preserve">, which is empty by design for the Rest and Disposal tasks, and</w:t>
+      </w:r>
+      <w:r>
+        <w:t xml:space="preserve"> </w:t>
+      </w:r>
+      <w:r>
+        <w:t xml:space="preserve">recorded durations agree with the difference between end and start times to</w:t>
+      </w:r>
+      <w:r>
+        <w:t xml:space="preserve"> </w:t>
+      </w:r>
+      <w:r>
+        <w:t xml:space="preserve">within ±1 second. Sixteen entries longer than 50 minutes are kept as recorded;</w:t>
+      </w:r>
+      <w:r>
+        <w:t xml:space="preserve"> </w:t>
+      </w:r>
+      <w:r>
+        <w:t xml:space="preserve">4 of them, in 2026-09-03_03, look like timers left running over a</w:t>
+      </w:r>
+      <w:r>
+        <w:t xml:space="preserve"> </w:t>
+      </w:r>
+      <w:r>
+        <w:t xml:space="preserve">break and are used in a sensitivity check below.</w:t>
       </w:r>
     </w:p>
     <w:bookmarkEnd w:id="11"/>
@@ -443,7 +539,7 @@
           <w:b/>
           <w:bCs/>
         </w:rPr>
-        <w:t xml:space="preserve">139.4 elapsed clock hours</w:t>
+        <w:t xml:space="preserve">143.6 elapsed clock hours</w:t>
       </w:r>
       <w:r>
         <w:t xml:space="preserve">, so on average</w:t>
@@ -452,7 +548,7 @@
         <w:t xml:space="preserve"> </w:t>
       </w:r>
       <w:r>
-        <w:t xml:space="preserve">3.7 gulpers’ worth of time was being recorded</w:t>
+        <w:t xml:space="preserve">3.5 gulpers’ worth of time was being recorded</w:t>
       </w:r>
       <w:r>
         <w:t xml:space="preserve"> </w:t>
@@ -476,19 +572,43 @@
         <w:t xml:space="preserve"> </w:t>
       </w:r>
       <w:r>
-        <w:t xml:space="preserve">elapsed time was 3.9 hours (median</w:t>
-      </w:r>
-      <w:r>
-        <w:t xml:space="preserve"> </w:t>
-      </w:r>
-      <w:r>
-        <w:t xml:space="preserve">3.4, range</w:t>
-      </w:r>
-      <w:r>
-        <w:t xml:space="preserve"> </w:t>
-      </w:r>
-      <w:r>
-        <w:t xml:space="preserve">0.8–9.7).</w:t>
+        <w:t xml:space="preserve">elapsed time was 4.0 hours (median</w:t>
+      </w:r>
+      <w:r>
+        <w:t xml:space="preserve"> </w:t>
+      </w:r>
+      <w:r>
+        <w:t xml:space="preserve">3.6, range</w:t>
+      </w:r>
+      <w:r>
+        <w:t xml:space="preserve"> </w:t>
+      </w:r>
+      <w:r>
+        <w:t xml:space="preserve">0.8–9.7). Capping the</w:t>
+      </w:r>
+      <w:r>
+        <w:t xml:space="preserve"> </w:t>
+      </w:r>
+      <w:r>
+        <w:t xml:space="preserve">4 suspect entries at 50 minutes would lower the total labour time</w:t>
+      </w:r>
+      <w:r>
+        <w:t xml:space="preserve"> </w:t>
+      </w:r>
+      <w:r>
+        <w:t xml:space="preserve">to 506.8 person-hours, a change of</w:t>
+      </w:r>
+      <w:r>
+        <w:t xml:space="preserve"> </w:t>
+      </w:r>
+      <w:r>
+        <w:t xml:space="preserve">2.2 person-hours</w:t>
+      </w:r>
+      <w:r>
+        <w:t xml:space="preserve"> </w:t>
+      </w:r>
+      <w:r>
+        <w:t xml:space="preserve">(0.4 %).</w:t>
       </w:r>
     </w:p>
     <w:p>
@@ -641,7 +761,7 @@
                     <w:jc w:val="center"/>
                   </w:pPr>
                   <w:r>
-                    <w:t xml:space="preserve">3,103</w:t>
+                    <w:t xml:space="preserve">3,101</w:t>
                   </w:r>
                 </w:p>
               </w:tc>
@@ -803,7 +923,7 @@
                     <w:jc w:val="center"/>
                   </w:pPr>
                   <w:r>
-                    <w:t xml:space="preserve">1,353</w:t>
+                    <w:t xml:space="preserve">1,352</w:t>
                   </w:r>
                 </w:p>
               </w:tc>
@@ -911,7 +1031,7 @@
                     <w:jc w:val="center"/>
                   </w:pPr>
                   <w:r>
-                    <w:t xml:space="preserve">149</w:t>
+                    <w:t xml:space="preserve">147</w:t>
                   </w:r>
                 </w:p>
               </w:tc>
@@ -1073,7 +1193,7 @@
                     <w:jc w:val="center"/>
                   </w:pPr>
                   <w:r>
-                    <w:t xml:space="preserve">257</w:t>
+                    <w:t xml:space="preserve">256</w:t>
                   </w:r>
                 </w:p>
               </w:tc>
@@ -1181,7 +1301,7 @@
                     <w:jc w:val="center"/>
                   </w:pPr>
                   <w:r>
-                    <w:t xml:space="preserve">10,784</w:t>
+                    <w:t xml:space="preserve">10,778</w:t>
                   </w:r>
                 </w:p>
               </w:tc>
@@ -1612,7 +1732,7 @@
         <w:t xml:space="preserve"> </w:t>
       </w:r>
       <w:r>
-        <w:t xml:space="preserve">(139.4 elapsed clock hours). For TDABC purposes the</w:t>
+        <w:t xml:space="preserve">(143.6 elapsed clock hours). For TDABC purposes the</w:t>
       </w:r>
       <w:r>
         <w:t xml:space="preserve"> </w:t>
@@ -1850,7 +1970,7 @@
                     <w:jc w:val="center"/>
                   </w:pPr>
                   <w:r>
-                    <w:t xml:space="preserve">121</w:t>
+                    <w:t xml:space="preserve">120</w:t>
                   </w:r>
                 </w:p>
               </w:tc>
@@ -1971,46 +2091,46 @@
                     <w:jc w:val="center"/>
                   </w:pPr>
                   <w:r>
-                    <w:t xml:space="preserve">4</w:t>
-                  </w:r>
-                </w:p>
-              </w:tc>
-              <w:tc>
-                <w:tcPr/>
-                <w:p>
-                  <w:pPr>
-                    <w:pStyle w:val="Compact"/>
-                    <w:jc w:val="right"/>
-                    <w:jc w:val="center"/>
-                  </w:pPr>
-                  <w:r>
-                    <w:t xml:space="preserve">375</w:t>
-                  </w:r>
-                </w:p>
-              </w:tc>
-              <w:tc>
-                <w:tcPr/>
-                <w:p>
-                  <w:pPr>
-                    <w:pStyle w:val="Compact"/>
-                    <w:jc w:val="right"/>
-                    <w:jc w:val="center"/>
-                  </w:pPr>
-                  <w:r>
-                    <w:t xml:space="preserve">12.0</w:t>
-                  </w:r>
-                </w:p>
-              </w:tc>
-              <w:tc>
-                <w:tcPr/>
-                <w:p>
-                  <w:pPr>
-                    <w:pStyle w:val="Compact"/>
-                    <w:jc w:val="right"/>
-                    <w:jc w:val="center"/>
-                  </w:pPr>
-                  <w:r>
-                    <w:t xml:space="preserve">3.1</w:t>
+                    <w:t xml:space="preserve">8</w:t>
+                  </w:r>
+                </w:p>
+              </w:tc>
+              <w:tc>
+                <w:tcPr/>
+                <w:p>
+                  <w:pPr>
+                    <w:pStyle w:val="Compact"/>
+                    <w:jc w:val="right"/>
+                    <w:jc w:val="center"/>
+                  </w:pPr>
+                  <w:r>
+                    <w:t xml:space="preserve">1,514</w:t>
+                  </w:r>
+                </w:p>
+              </w:tc>
+              <w:tc>
+                <w:tcPr/>
+                <w:p>
+                  <w:pPr>
+                    <w:pStyle w:val="Compact"/>
+                    <w:jc w:val="right"/>
+                    <w:jc w:val="center"/>
+                  </w:pPr>
+                  <w:r>
+                    <w:t xml:space="preserve">38.5</w:t>
+                  </w:r>
+                </w:p>
+              </w:tc>
+              <w:tc>
+                <w:tcPr/>
+                <w:p>
+                  <w:pPr>
+                    <w:pStyle w:val="Compact"/>
+                    <w:jc w:val="right"/>
+                    <w:jc w:val="center"/>
+                  </w:pPr>
+                  <w:r>
+                    <w:t xml:space="preserve">7.7</w:t>
                   </w:r>
                 </w:p>
               </w:tc>
@@ -2025,59 +2145,59 @@
                     <w:jc w:val="center"/>
                   </w:pPr>
                   <w:r>
-                    <w:t xml:space="preserve">2026-06-13_01</w:t>
-                  </w:r>
-                </w:p>
-              </w:tc>
-              <w:tc>
-                <w:tcPr/>
-                <w:p>
-                  <w:pPr>
-                    <w:pStyle w:val="Compact"/>
-                    <w:jc w:val="right"/>
-                    <w:jc w:val="center"/>
-                  </w:pPr>
-                  <w:r>
-                    <w:t xml:space="preserve">8</w:t>
-                  </w:r>
-                </w:p>
-              </w:tc>
-              <w:tc>
-                <w:tcPr/>
-                <w:p>
-                  <w:pPr>
-                    <w:pStyle w:val="Compact"/>
-                    <w:jc w:val="right"/>
-                    <w:jc w:val="center"/>
-                  </w:pPr>
-                  <w:r>
-                    <w:t xml:space="preserve">1,139</w:t>
-                  </w:r>
-                </w:p>
-              </w:tc>
-              <w:tc>
-                <w:tcPr/>
-                <w:p>
-                  <w:pPr>
-                    <w:pStyle w:val="Compact"/>
-                    <w:jc w:val="right"/>
-                    <w:jc w:val="center"/>
-                  </w:pPr>
-                  <w:r>
-                    <w:t xml:space="preserve">26.5</w:t>
-                  </w:r>
-                </w:p>
-              </w:tc>
-              <w:tc>
-                <w:tcPr/>
-                <w:p>
-                  <w:pPr>
-                    <w:pStyle w:val="Compact"/>
-                    <w:jc w:val="right"/>
-                    <w:jc w:val="center"/>
-                  </w:pPr>
-                  <w:r>
-                    <w:t xml:space="preserve">4.6</w:t>
+                    <w:t xml:space="preserve">2026-06-13_03</w:t>
+                  </w:r>
+                </w:p>
+              </w:tc>
+              <w:tc>
+                <w:tcPr/>
+                <w:p>
+                  <w:pPr>
+                    <w:pStyle w:val="Compact"/>
+                    <w:jc w:val="right"/>
+                    <w:jc w:val="center"/>
+                  </w:pPr>
+                  <w:r>
+                    <w:t xml:space="preserve">3</w:t>
+                  </w:r>
+                </w:p>
+              </w:tc>
+              <w:tc>
+                <w:tcPr/>
+                <w:p>
+                  <w:pPr>
+                    <w:pStyle w:val="Compact"/>
+                    <w:jc w:val="right"/>
+                    <w:jc w:val="center"/>
+                  </w:pPr>
+                  <w:r>
+                    <w:t xml:space="preserve">241</w:t>
+                  </w:r>
+                </w:p>
+              </w:tc>
+              <w:tc>
+                <w:tcPr/>
+                <w:p>
+                  <w:pPr>
+                    <w:pStyle w:val="Compact"/>
+                    <w:jc w:val="right"/>
+                    <w:jc w:val="center"/>
+                  </w:pPr>
+                  <w:r>
+                    <w:t xml:space="preserve">7.0</w:t>
+                  </w:r>
+                </w:p>
+              </w:tc>
+              <w:tc>
+                <w:tcPr/>
+                <w:p>
+                  <w:pPr>
+                    <w:pStyle w:val="Compact"/>
+                    <w:jc w:val="right"/>
+                    <w:jc w:val="center"/>
+                  </w:pPr>
+                  <w:r>
+                    <w:t xml:space="preserve">2.3</w:t>
                   </w:r>
                 </w:p>
               </w:tc>
@@ -2092,59 +2212,59 @@
                     <w:jc w:val="center"/>
                   </w:pPr>
                   <w:r>
-                    <w:t xml:space="preserve">2026-06-13_03</w:t>
-                  </w:r>
-                </w:p>
-              </w:tc>
-              <w:tc>
-                <w:tcPr/>
-                <w:p>
-                  <w:pPr>
-                    <w:pStyle w:val="Compact"/>
-                    <w:jc w:val="right"/>
-                    <w:jc w:val="center"/>
-                  </w:pPr>
-                  <w:r>
-                    <w:t xml:space="preserve">3</w:t>
-                  </w:r>
-                </w:p>
-              </w:tc>
-              <w:tc>
-                <w:tcPr/>
-                <w:p>
-                  <w:pPr>
-                    <w:pStyle w:val="Compact"/>
-                    <w:jc w:val="right"/>
-                    <w:jc w:val="center"/>
-                  </w:pPr>
-                  <w:r>
-                    <w:t xml:space="preserve">241</w:t>
-                  </w:r>
-                </w:p>
-              </w:tc>
-              <w:tc>
-                <w:tcPr/>
-                <w:p>
-                  <w:pPr>
-                    <w:pStyle w:val="Compact"/>
-                    <w:jc w:val="right"/>
-                    <w:jc w:val="center"/>
-                  </w:pPr>
-                  <w:r>
-                    <w:t xml:space="preserve">7.0</w:t>
-                  </w:r>
-                </w:p>
-              </w:tc>
-              <w:tc>
-                <w:tcPr/>
-                <w:p>
-                  <w:pPr>
-                    <w:pStyle w:val="Compact"/>
-                    <w:jc w:val="right"/>
-                    <w:jc w:val="center"/>
-                  </w:pPr>
-                  <w:r>
-                    <w:t xml:space="preserve">2.3</w:t>
+                    <w:t xml:space="preserve">2026-06-14_02a</w:t>
+                  </w:r>
+                </w:p>
+              </w:tc>
+              <w:tc>
+                <w:tcPr/>
+                <w:p>
+                  <w:pPr>
+                    <w:pStyle w:val="Compact"/>
+                    <w:jc w:val="right"/>
+                    <w:jc w:val="center"/>
+                  </w:pPr>
+                  <w:r>
+                    <w:t xml:space="preserve">4</w:t>
+                  </w:r>
+                </w:p>
+              </w:tc>
+              <w:tc>
+                <w:tcPr/>
+                <w:p>
+                  <w:pPr>
+                    <w:pStyle w:val="Compact"/>
+                    <w:jc w:val="right"/>
+                    <w:jc w:val="center"/>
+                  </w:pPr>
+                  <w:r>
+                    <w:t xml:space="preserve">455</w:t>
+                  </w:r>
+                </w:p>
+              </w:tc>
+              <w:tc>
+                <w:tcPr/>
+                <w:p>
+                  <w:pPr>
+                    <w:pStyle w:val="Compact"/>
+                    <w:jc w:val="right"/>
+                    <w:jc w:val="center"/>
+                  </w:pPr>
+                  <w:r>
+                    <w:t xml:space="preserve">27.0</w:t>
+                  </w:r>
+                </w:p>
+              </w:tc>
+              <w:tc>
+                <w:tcPr/>
+                <w:p>
+                  <w:pPr>
+                    <w:pStyle w:val="Compact"/>
+                    <w:jc w:val="right"/>
+                    <w:jc w:val="center"/>
+                  </w:pPr>
+                  <w:r>
+                    <w:t xml:space="preserve">8.3</w:t>
                   </w:r>
                 </w:p>
               </w:tc>
@@ -2159,59 +2279,59 @@
                     <w:jc w:val="center"/>
                   </w:pPr>
                   <w:r>
-                    <w:t xml:space="preserve">2026-06-14_02</w:t>
-                  </w:r>
-                </w:p>
-              </w:tc>
-              <w:tc>
-                <w:tcPr/>
-                <w:p>
-                  <w:pPr>
-                    <w:pStyle w:val="Compact"/>
-                    <w:jc w:val="right"/>
-                    <w:jc w:val="center"/>
-                  </w:pPr>
-                  <w:r>
-                    <w:t xml:space="preserve">7</w:t>
-                  </w:r>
-                </w:p>
-              </w:tc>
-              <w:tc>
-                <w:tcPr/>
-                <w:p>
-                  <w:pPr>
-                    <w:pStyle w:val="Compact"/>
-                    <w:jc w:val="right"/>
-                    <w:jc w:val="center"/>
-                  </w:pPr>
-                  <w:r>
-                    <w:t xml:space="preserve">1,187</w:t>
-                  </w:r>
-                </w:p>
-              </w:tc>
-              <w:tc>
-                <w:tcPr/>
-                <w:p>
-                  <w:pPr>
-                    <w:pStyle w:val="Compact"/>
-                    <w:jc w:val="right"/>
-                    <w:jc w:val="center"/>
-                  </w:pPr>
-                  <w:r>
-                    <w:t xml:space="preserve">39.3</w:t>
-                  </w:r>
-                </w:p>
-              </w:tc>
-              <w:tc>
-                <w:tcPr/>
-                <w:p>
-                  <w:pPr>
-                    <w:pStyle w:val="Compact"/>
-                    <w:jc w:val="right"/>
-                    <w:jc w:val="center"/>
-                  </w:pPr>
-                  <w:r>
-                    <w:t xml:space="preserve">8.3</w:t>
+                    <w:t xml:space="preserve">2026-06-14_02b</w:t>
+                  </w:r>
+                </w:p>
+              </w:tc>
+              <w:tc>
+                <w:tcPr/>
+                <w:p>
+                  <w:pPr>
+                    <w:pStyle w:val="Compact"/>
+                    <w:jc w:val="right"/>
+                    <w:jc w:val="center"/>
+                  </w:pPr>
+                  <w:r>
+                    <w:t xml:space="preserve">3</w:t>
+                  </w:r>
+                </w:p>
+              </w:tc>
+              <w:tc>
+                <w:tcPr/>
+                <w:p>
+                  <w:pPr>
+                    <w:pStyle w:val="Compact"/>
+                    <w:jc w:val="right"/>
+                    <w:jc w:val="center"/>
+                  </w:pPr>
+                  <w:r>
+                    <w:t xml:space="preserve">731</w:t>
+                  </w:r>
+                </w:p>
+              </w:tc>
+              <w:tc>
+                <w:tcPr/>
+                <w:p>
+                  <w:pPr>
+                    <w:pStyle w:val="Compact"/>
+                    <w:jc w:val="right"/>
+                    <w:jc w:val="center"/>
+                  </w:pPr>
+                  <w:r>
+                    <w:t xml:space="preserve">12.3</w:t>
+                  </w:r>
+                </w:p>
+              </w:tc>
+              <w:tc>
+                <w:tcPr/>
+                <w:p>
+                  <w:pPr>
+                    <w:pStyle w:val="Compact"/>
+                    <w:jc w:val="right"/>
+                    <w:jc w:val="center"/>
+                  </w:pPr>
+                  <w:r>
+                    <w:t xml:space="preserve">4.2</w:t>
                   </w:r>
                 </w:p>
               </w:tc>
@@ -2855,7 +2975,7 @@
                     <w:jc w:val="center"/>
                   </w:pPr>
                   <w:r>
-                    <w:t xml:space="preserve">456</w:t>
+                    <w:t xml:space="preserve">455</w:t>
                   </w:r>
                 </w:p>
               </w:tc>
@@ -3056,7 +3176,7 @@
                     <w:jc w:val="center"/>
                   </w:pPr>
                   <w:r>
-                    <w:t xml:space="preserve">404</w:t>
+                    <w:t xml:space="preserve">403</w:t>
                   </w:r>
                 </w:p>
               </w:tc>
@@ -3793,7 +3913,7 @@
                     <w:jc w:val="center"/>
                   </w:pPr>
                   <w:r>
-                    <w:t xml:space="preserve">630</w:t>
+                    <w:t xml:space="preserve">628</w:t>
                   </w:r>
                 </w:p>
               </w:tc>
@@ -4195,7 +4315,7 @@
                     <w:jc w:val="center"/>
                   </w:pPr>
                   <w:r>
-                    <w:t xml:space="preserve">10,784</w:t>
+                    <w:t xml:space="preserve">10,778</w:t>
                   </w:r>
                 </w:p>
               </w:tc>
@@ -4221,7 +4341,7 @@
                     <w:jc w:val="center"/>
                   </w:pPr>
                   <w:r>
-                    <w:t xml:space="preserve">139.4</w:t>
+                    <w:t xml:space="preserve">143.6</w:t>
                   </w:r>
                 </w:p>
               </w:tc>

</xml_diff>